<commit_message>
feat: optimize report analysis alarms and management UI
</commit_message>
<xml_diff>
--- a/docs/操作手册/切割生产智能产报系统操作手册.docx
+++ b/docs/操作手册/切割生产智能产报系统操作手册.docx
@@ -23,6 +23,12 @@
     <w:sdt>
       <w:sdtPr>
         <w:rPr>
+          <w:rFonts w:ascii="Times New Roman" w:hAnsi="Times New Roman" w:cs="Times New Roman (正文 CS 字体)"/>
+          <w:b w:val="0"/>
+          <w:bCs w:val="0"/>
+          <w:color w:val="1F2F3A"/>
+          <w:sz w:val="24"/>
+          <w:szCs w:val="22"/>
           <w:lang w:val="zh-CN"/>
         </w:rPr>
         <w:id w:val="-1198771795"/>
@@ -33,11 +39,7 @@
       </w:sdtPr>
       <w:sdtEndPr>
         <w:rPr>
-          <w:rFonts w:ascii="Times New Roman" w:hAnsi="Times New Roman" w:cs="Times New Roman (正文 CS 字体)"/>
           <w:noProof/>
-          <w:color w:val="1F2F3A"/>
-          <w:sz w:val="24"/>
-          <w:szCs w:val="22"/>
           <w:lang w:val="en-US"/>
         </w:rPr>
       </w:sdtEndPr>
@@ -1956,7 +1958,6 @@
       <w:pPr>
         <w:ind w:left="317" w:firstLine="480"/>
         <w:rPr>
-          <w:rFonts w:hint="eastAsia"/>
           <w:lang w:eastAsia="zh-CN"/>
         </w:rPr>
       </w:pPr>
@@ -1998,25 +1999,17 @@
     <w:p>
       <w:pPr>
         <w:pStyle w:val="21"/>
-        <w:ind w:firstLine="469"/>
-        <w:rPr>
+        <w:numPr>
+          <w:ilvl w:val="0"/>
+          <w:numId w:val="10"/>
+        </w:numPr>
+        <w:ind w:firstLineChars="0"/>
+        <w:rPr>
+          <w:rFonts w:ascii="宋体" w:hAnsi="宋体" w:cs="微软雅黑"/>
           <w:lang w:eastAsia="zh-CN"/>
         </w:rPr>
       </w:pPr>
       <w:bookmarkStart w:id="1" w:name="_Toc241067582"/>
-      <w:r>
-        <w:rPr>
-          <w:lang w:eastAsia="zh-CN"/>
-        </w:rPr>
-        <w:t>一</w:t>
-      </w:r>
-      <w:r>
-        <w:rPr>
-          <w:rFonts w:hint="eastAsia"/>
-          <w:lang w:eastAsia="zh-CN"/>
-        </w:rPr>
-        <w:t>、</w:t>
-      </w:r>
       <w:r>
         <w:rPr>
           <w:rFonts w:ascii="宋体" w:hAnsi="宋体"/>
@@ -2051,14 +2044,50 @@
       <w:pPr>
         <w:ind w:firstLine="480"/>
         <w:rPr>
+          <w:rFonts w:hint="eastAsia"/>
           <w:lang w:eastAsia="zh-CN"/>
         </w:rPr>
       </w:pPr>
-      <w:r>
-        <w:rPr>
-          <w:lang w:eastAsia="zh-CN"/>
-        </w:rPr>
-        <w:t>使用单位提供的内网地址登录。管理员登录后进入</w:t>
+    </w:p>
+    <w:p>
+      <w:pPr>
+        <w:ind w:firstLine="480"/>
+        <w:rPr>
+          <w:lang w:eastAsia="zh-CN"/>
+        </w:rPr>
+      </w:pPr>
+      <w:r>
+        <w:rPr>
+          <w:lang w:eastAsia="zh-CN"/>
+        </w:rPr>
+        <w:t>使用单位提供的内网地址</w:t>
+      </w:r>
+      <w:r>
+        <w:rPr>
+          <w:rFonts w:hint="eastAsia"/>
+          <w:lang w:eastAsia="zh-CN"/>
+        </w:rPr>
+        <w:t>（</w:t>
+      </w:r>
+      <w:r>
+        <w:rPr>
+          <w:rFonts w:hint="eastAsia"/>
+          <w:lang w:eastAsia="zh-CN"/>
+        </w:rPr>
+        <w:t>10.147.0.71:8080</w:t>
+      </w:r>
+      <w:r>
+        <w:rPr>
+          <w:rFonts w:hint="eastAsia"/>
+          <w:lang w:eastAsia="zh-CN"/>
+        </w:rPr>
+        <w:t>）</w:t>
+      </w:r>
+      <w:r>
+        <w:rPr>
+          <w:lang w:eastAsia="zh-CN"/>
+        </w:rPr>
+        <w:t>登录。管理员登录后进入</w:t>
       </w:r>
       <w:r>
         <w:rPr>
@@ -4182,7 +4211,6 @@
       <w:pPr>
         <w:ind w:left="317" w:firstLine="489"/>
         <w:rPr>
-          <w:rFonts w:hint="eastAsia"/>
           <w:lang w:eastAsia="zh-CN"/>
         </w:rPr>
       </w:pPr>
@@ -7395,6 +7423,95 @@
       </w:rPr>
     </w:lvl>
   </w:abstractNum>
+  <w:abstractNum w:abstractNumId="9" w15:restartNumberingAfterBreak="0">
+    <w:nsid w:val="15B32C87"/>
+    <w:multiLevelType w:val="hybridMultilevel"/>
+    <w:tmpl w:val="6A8CED6E"/>
+    <w:lvl w:ilvl="0" w:tplc="0B9262A2">
+      <w:start w:val="1"/>
+      <w:numFmt w:val="japaneseCounting"/>
+      <w:lvlText w:val="%1、"/>
+      <w:lvlJc w:val="left"/>
+      <w:pPr>
+        <w:ind w:left="929" w:hanging="460"/>
+      </w:pPr>
+      <w:rPr>
+        <w:rFonts w:ascii="Times New Roman" w:hAnsi="Times New Roman" w:cs="Times New Roman (标题 CS)" w:hint="default"/>
+      </w:rPr>
+    </w:lvl>
+    <w:lvl w:ilvl="1" w:tplc="04090019" w:tentative="1">
+      <w:start w:val="1"/>
+      <w:numFmt w:val="lowerLetter"/>
+      <w:lvlText w:val="%2)"/>
+      <w:lvlJc w:val="left"/>
+      <w:pPr>
+        <w:ind w:left="1349" w:hanging="440"/>
+      </w:pPr>
+    </w:lvl>
+    <w:lvl w:ilvl="2" w:tplc="0409001B" w:tentative="1">
+      <w:start w:val="1"/>
+      <w:numFmt w:val="lowerRoman"/>
+      <w:lvlText w:val="%3."/>
+      <w:lvlJc w:val="right"/>
+      <w:pPr>
+        <w:ind w:left="1789" w:hanging="440"/>
+      </w:pPr>
+    </w:lvl>
+    <w:lvl w:ilvl="3" w:tplc="0409000F" w:tentative="1">
+      <w:start w:val="1"/>
+      <w:numFmt w:val="decimal"/>
+      <w:lvlText w:val="%4."/>
+      <w:lvlJc w:val="left"/>
+      <w:pPr>
+        <w:ind w:left="2229" w:hanging="440"/>
+      </w:pPr>
+    </w:lvl>
+    <w:lvl w:ilvl="4" w:tplc="04090019" w:tentative="1">
+      <w:start w:val="1"/>
+      <w:numFmt w:val="lowerLetter"/>
+      <w:lvlText w:val="%5)"/>
+      <w:lvlJc w:val="left"/>
+      <w:pPr>
+        <w:ind w:left="2669" w:hanging="440"/>
+      </w:pPr>
+    </w:lvl>
+    <w:lvl w:ilvl="5" w:tplc="0409001B" w:tentative="1">
+      <w:start w:val="1"/>
+      <w:numFmt w:val="lowerRoman"/>
+      <w:lvlText w:val="%6."/>
+      <w:lvlJc w:val="right"/>
+      <w:pPr>
+        <w:ind w:left="3109" w:hanging="440"/>
+      </w:pPr>
+    </w:lvl>
+    <w:lvl w:ilvl="6" w:tplc="0409000F" w:tentative="1">
+      <w:start w:val="1"/>
+      <w:numFmt w:val="decimal"/>
+      <w:lvlText w:val="%7."/>
+      <w:lvlJc w:val="left"/>
+      <w:pPr>
+        <w:ind w:left="3549" w:hanging="440"/>
+      </w:pPr>
+    </w:lvl>
+    <w:lvl w:ilvl="7" w:tplc="04090019" w:tentative="1">
+      <w:start w:val="1"/>
+      <w:numFmt w:val="lowerLetter"/>
+      <w:lvlText w:val="%8)"/>
+      <w:lvlJc w:val="left"/>
+      <w:pPr>
+        <w:ind w:left="3989" w:hanging="440"/>
+      </w:pPr>
+    </w:lvl>
+    <w:lvl w:ilvl="8" w:tplc="0409001B" w:tentative="1">
+      <w:start w:val="1"/>
+      <w:numFmt w:val="lowerRoman"/>
+      <w:lvlText w:val="%9."/>
+      <w:lvlJc w:val="right"/>
+      <w:pPr>
+        <w:ind w:left="4429" w:hanging="440"/>
+      </w:pPr>
+    </w:lvl>
+  </w:abstractNum>
   <w:num w:numId="1" w16cid:durableId="483661917">
     <w:abstractNumId w:val="8"/>
   </w:num>
@@ -7421,6 +7538,9 @@
   </w:num>
   <w:num w:numId="9" w16cid:durableId="583152603">
     <w:abstractNumId w:val="0"/>
+  </w:num>
+  <w:num w:numId="10" w16cid:durableId="289476014">
+    <w:abstractNumId w:val="9"/>
   </w:num>
 </w:numbering>
 </file>

</xml_diff>